<commit_message>
Plan de pruebas actualizado
</commit_message>
<xml_diff>
--- a/Actividades/Plan de Pruebas Proyecto .docx
+++ b/Actividades/Plan de Pruebas Proyecto .docx
@@ -130,6 +130,83 @@
         </w:rPr>
         <w:t>Pedro José Esquea Osorio</w:t>
       </w:r>
+    </w:p>
+    <w:p>
+      <w:pPr>
+        <w:numPr>
+          <w:ilvl w:val="0"/>
+          <w:numId w:val="12"/>
+        </w:numPr>
+        <w:rPr>
+          <w:rFonts w:ascii="Times New Roman" w:eastAsia="Times New Roman" w:hAnsi="Times New Roman" w:cs="Times New Roman"/>
+          <w:b/>
+          <w:bCs/>
+          <w:sz w:val="24"/>
+          <w:szCs w:val="24"/>
+          <w:lang w:eastAsia="es-CO"/>
+        </w:rPr>
+      </w:pPr>
+      <w:proofErr w:type="spellStart"/>
+      <w:r>
+        <w:rPr>
+          <w:rFonts w:ascii="Times New Roman" w:eastAsia="Times New Roman" w:hAnsi="Times New Roman" w:cs="Times New Roman"/>
+          <w:b/>
+          <w:bCs/>
+          <w:sz w:val="24"/>
+          <w:szCs w:val="24"/>
+          <w:lang w:eastAsia="es-CO"/>
+        </w:rPr>
+        <w:t>Andres</w:t>
+      </w:r>
+      <w:proofErr w:type="spellEnd"/>
+      <w:r>
+        <w:rPr>
+          <w:rFonts w:ascii="Times New Roman" w:eastAsia="Times New Roman" w:hAnsi="Times New Roman" w:cs="Times New Roman"/>
+          <w:b/>
+          <w:bCs/>
+          <w:sz w:val="24"/>
+          <w:szCs w:val="24"/>
+          <w:lang w:eastAsia="es-CO"/>
+        </w:rPr>
+        <w:t xml:space="preserve"> David </w:t>
+      </w:r>
+      <w:proofErr w:type="spellStart"/>
+      <w:r>
+        <w:rPr>
+          <w:rFonts w:ascii="Times New Roman" w:eastAsia="Times New Roman" w:hAnsi="Times New Roman" w:cs="Times New Roman"/>
+          <w:b/>
+          <w:bCs/>
+          <w:sz w:val="24"/>
+          <w:szCs w:val="24"/>
+          <w:lang w:eastAsia="es-CO"/>
+        </w:rPr>
+        <w:t>Garcia</w:t>
+      </w:r>
+      <w:proofErr w:type="spellEnd"/>
+      <w:r>
+        <w:rPr>
+          <w:rFonts w:ascii="Times New Roman" w:eastAsia="Times New Roman" w:hAnsi="Times New Roman" w:cs="Times New Roman"/>
+          <w:b/>
+          <w:bCs/>
+          <w:sz w:val="24"/>
+          <w:szCs w:val="24"/>
+          <w:lang w:eastAsia="es-CO"/>
+        </w:rPr>
+        <w:t xml:space="preserve"> Rivera</w:t>
+      </w:r>
+    </w:p>
+    <w:p>
+      <w:pPr>
+        <w:ind w:left="360"/>
+        <w:rPr>
+          <w:rFonts w:ascii="Times New Roman" w:eastAsia="Times New Roman" w:hAnsi="Times New Roman" w:cs="Times New Roman"/>
+          <w:b/>
+          <w:bCs/>
+          <w:sz w:val="24"/>
+          <w:szCs w:val="24"/>
+          <w:lang w:eastAsia="es-CO"/>
+        </w:rPr>
+      </w:pPr>
     </w:p>
     <w:p>
       <w:pPr>
@@ -4055,15 +4132,6 @@
   </w:num>
   <w:num w:numId="12" w16cid:durableId="806556220">
     <w:abstractNumId w:val="8"/>
-    <w:lvlOverride w:ilvl="0"/>
-    <w:lvlOverride w:ilvl="1"/>
-    <w:lvlOverride w:ilvl="2"/>
-    <w:lvlOverride w:ilvl="3"/>
-    <w:lvlOverride w:ilvl="4"/>
-    <w:lvlOverride w:ilvl="5"/>
-    <w:lvlOverride w:ilvl="6"/>
-    <w:lvlOverride w:ilvl="7"/>
-    <w:lvlOverride w:ilvl="8"/>
   </w:num>
 </w:numbering>
 </file>
@@ -4531,6 +4599,7 @@
   <w:style w:type="character" w:default="1" w:styleId="Fuentedeprrafopredeter">
     <w:name w:val="Default Paragraph Font"/>
     <w:uiPriority w:val="1"/>
+    <w:semiHidden/>
     <w:unhideWhenUsed/>
   </w:style>
   <w:style w:type="table" w:default="1" w:styleId="Tablanormal">

</xml_diff>